<commit_message>
Widen schedule table columns in PW2
Co-Authored-By: Claude Opus 5.5 <noreply@anthropic.com>
Claude-Session: https://claude.ai/code/session_012RYRTWe7K8pEBRxnujF3uJ
</commit_message>
<xml_diff>
--- a/pw-02-research-plan/pw-02-research-plan.docx
+++ b/pw-02-research-plan/pw-02-research-plan.docx
@@ -5656,10 +5656,10 @@
         <w:jc w:val="start"/>
       </w:tblPr>
       <w:tblGrid>
-        <w:gridCol w:w="2640"/>
-        <w:gridCol w:w="1320"/>
-        <w:gridCol w:w="806"/>
-        <w:gridCol w:w="3153"/>
+        <w:gridCol w:w="2501"/>
+        <w:gridCol w:w="1250"/>
+        <w:gridCol w:w="1083"/>
+        <w:gridCol w:w="3084"/>
       </w:tblGrid>
       <w:tr>
         <w:trPr>

</xml_diff>